<commit_message>
feat: lógica de input de usuário implementada
</commit_message>
<xml_diff>
--- a/Relatorio_Gerencial_Completo_2025-05.docx
+++ b/Relatorio_Gerencial_Completo_2025-05.docx
@@ -302,73 +302,7 @@
         <w:pStyle w:val="Título3"/>
       </w:pPr>
       <w:r>
-        <w:t>2.1. Evolução das Adesões</w:t>
-      </w:r>
-    </w:p>
-    <w:p>
-      <w:pPr>
-        <w:pStyle w:val="CorpoComRecuo"/>
-      </w:pPr>
-      <w:r>
-        <w:t>Com as movimentações ocorridas no mês de maio de 2025, houve aumento de 81 participantes na base. As ocorrências estão assim distribuídas:</w:t>
-      </w:r>
-    </w:p>
-    <w:p>
-      <w:pPr>
-        <w:jc w:val="center"/>
-      </w:pPr>
-      <w:r>
-        <w:t>Tabela 1. Evolução mensal das adesões</w:t>
-      </w:r>
-    </w:p>
-    <w:p>
-      <w:r>
-        <w:drawing>
-          <wp:inline xmlns:a="http://schemas.openxmlformats.org/drawingml/2006/main" xmlns:pic="http://schemas.openxmlformats.org/drawingml/2006/picture">
-            <wp:extent cx="5669280" cy="2923222"/>
-            <wp:docPr id="9" name="Picture 9"/>
-            <wp:cNvGraphicFramePr>
-              <a:graphicFrameLocks noChangeAspect="1"/>
-            </wp:cNvGraphicFramePr>
-            <a:graphic>
-              <a:graphicData uri="http://schemas.openxmlformats.org/drawingml/2006/picture">
-                <pic:pic>
-                  <pic:nvPicPr>
-                    <pic:cNvPr id="0" name="tabela_evolucao.png"/>
-                    <pic:cNvPicPr/>
-                  </pic:nvPicPr>
-                  <pic:blipFill>
-                    <a:blip r:embed="rId17"/>
-                    <a:stretch>
-                      <a:fillRect/>
-                    </a:stretch>
-                  </pic:blipFill>
-                  <pic:spPr>
-                    <a:xfrm>
-                      <a:off x="0" y="0"/>
-                      <a:ext cx="5669280" cy="2923222"/>
-                    </a:xfrm>
-                    <a:prstGeom prst="rect"/>
-                  </pic:spPr>
-                </pic:pic>
-              </a:graphicData>
-            </a:graphic>
-          </wp:inline>
-        </w:drawing>
-      </w:r>
-    </w:p>
-    <w:p>
-      <w:r>
-        <w:t>Fonte: DISEG/GEARC</w:t>
-      </w:r>
-    </w:p>
-    <w:p>
-      <w:pPr>
-        <w:pStyle w:val="Título3"/>
-      </w:pPr>
-      <w:r>
-        <w:br/>
-        <w:t>2.2. Distribuição de participantes por sexo</w:t>
+        <w:t>2.1. Distribuição de participantes por sexo</w:t>
       </w:r>
     </w:p>
     <w:p>
@@ -384,7 +318,7 @@
         <w:drawing>
           <wp:inline xmlns:a="http://schemas.openxmlformats.org/drawingml/2006/main" xmlns:pic="http://schemas.openxmlformats.org/drawingml/2006/picture">
             <wp:extent cx="5486400" cy="850392"/>
-            <wp:docPr id="10" name="Picture 10"/>
+            <wp:docPr id="9" name="Picture 9"/>
             <wp:cNvGraphicFramePr>
               <a:graphicFrameLocks noChangeAspect="1"/>
             </wp:cNvGraphicFramePr>
@@ -396,7 +330,7 @@
                     <pic:cNvPicPr/>
                   </pic:nvPicPr>
                   <pic:blipFill>
-                    <a:blip r:embed="rId18"/>
+                    <a:blip r:embed="rId17"/>
                     <a:stretch>
                       <a:fillRect/>
                     </a:stretch>
@@ -421,7 +355,7 @@
       </w:pPr>
       <w:r>
         <w:br/>
-        <w:t>2.3. Distribuição de participantes por Sexo e Grupos de Idade</w:t>
+        <w:t>2.2. Distribuição de participantes por Sexo e Grupos de Idade</w:t>
       </w:r>
     </w:p>
     <w:p>
@@ -445,7 +379,7 @@
         <w:drawing>
           <wp:inline xmlns:a="http://schemas.openxmlformats.org/drawingml/2006/main" xmlns:pic="http://schemas.openxmlformats.org/drawingml/2006/picture">
             <wp:extent cx="5669280" cy="3936321"/>
-            <wp:docPr id="11" name="Picture 11"/>
+            <wp:docPr id="10" name="Picture 10"/>
             <wp:cNvGraphicFramePr>
               <a:graphicFrameLocks noChangeAspect="1"/>
             </wp:cNvGraphicFramePr>
@@ -457,7 +391,7 @@
                     <pic:cNvPicPr/>
                   </pic:nvPicPr>
                   <pic:blipFill>
-                    <a:blip r:embed="rId19"/>
+                    <a:blip r:embed="rId18"/>
                     <a:stretch>
                       <a:fillRect/>
                     </a:stretch>

</xml_diff>